<commit_message>
Invoice Word sample: footer in the page body
The slogan and contact footer sat in Word's page-footer area, which Quick
Look, Web Layout and phone/email previews don't show. It now follows the
notes in the page itself. Also removes a duplicated table layout setting.

Co-Authored-By: Claude Opus 5.5 <noreply@anthropic.com>
</commit_message>
<xml_diff>
--- a/docs/invoice/Revamp-Invoice-Sample.docx
+++ b/docs/invoice/Revamp-Invoice-Sample.docx
@@ -38,7 +38,6 @@
           <w:insideH w:val="none" w:sz="0" w:space="0" w:color="auto"/>
           <w:insideV w:val="none" w:sz="0" w:space="0" w:color="auto"/>
         </w:tblBorders>
-        <w:tblLayout w:type="fixed"/>
         <w:tblLayout w:type="fixed"/>
         <w:tblCellMar>
           <w:top w:w="0" w:type="dxa"/>
@@ -154,7 +153,6 @@
           <w:insideH w:val="none" w:sz="0" w:space="0" w:color="auto"/>
           <w:insideV w:val="none" w:sz="0" w:space="0" w:color="auto"/>
         </w:tblBorders>
-        <w:tblLayout w:type="fixed"/>
         <w:tblLayout w:type="fixed"/>
         <w:tblCellMar>
           <w:top w:w="0" w:type="dxa"/>
@@ -413,7 +411,6 @@
           <w:insideV w:val="none" w:sz="0" w:space="0" w:color="auto"/>
         </w:tblBorders>
         <w:tblLayout w:type="fixed"/>
-        <w:tblLayout w:type="fixed"/>
         <w:tblCellMar>
           <w:top w:w="100" w:type="dxa"/>
           <w:left w:w="170" w:type="dxa"/>
@@ -639,7 +636,6 @@
           <w:insideV w:val="none" w:sz="0" w:space="0" w:color="auto"/>
         </w:tblBorders>
         <w:tblLayout w:type="fixed"/>
-        <w:tblLayout w:type="fixed"/>
         <w:tblCellMar>
           <w:top w:w="85" w:type="dxa"/>
           <w:left w:w="170" w:type="dxa"/>
@@ -852,7 +848,6 @@
           <w:insideH w:val="none" w:sz="0" w:space="0" w:color="auto"/>
           <w:insideV w:val="none" w:sz="0" w:space="0" w:color="auto"/>
         </w:tblBorders>
-        <w:tblLayout w:type="fixed"/>
         <w:tblLayout w:type="fixed"/>
         <w:tblCellMar>
           <w:top w:w="40" w:type="dxa"/>
@@ -1203,147 +1198,155 @@
         <w:t>Thank you for booking with Revamp Vacations. Cancellation terms: free cancellation up to 7 days before check-in.</w:t>
       </w:r>
     </w:p>
+    <w:p>
+      <w:pPr>
+        <w:spacing w:before="0" w:after="0" w:lineRule="exact" w:line="600"/>
+        <w:rPr>
+          <w:sz w:val="2"/>
+        </w:rPr>
+      </w:pPr>
+      <w:r>
+        <w:rPr>
+          <w:rFonts w:ascii="Helvetica Neue" w:hAnsi="Helvetica Neue" w:cs="Helvetica Neue" w:eastAsia="Helvetica Neue"/>
+          <w:b w:val="0"/>
+          <w:color w:val="212121"/>
+          <w:sz w:val="2"/>
+        </w:rPr>
+      </w:r>
+    </w:p>
+    <w:p>
+      <w:pPr>
+        <w:pBdr>
+          <w:bottom w:val="single" w:sz="4" w:space="0" w:color="E4DED3"/>
+        </w:pBdr>
+        <w:spacing w:before="0" w:after="0" w:lineRule="exact" w:line="40"/>
+      </w:pPr>
+    </w:p>
+    <w:tbl>
+      <w:tblPr>
+        <w:tblW w:w="9866" w:type="dxa"/>
+        <w:tblInd w:w="0" w:type="dxa"/>
+        <w:tblBorders>
+          <w:top w:val="none" w:sz="0" w:space="0" w:color="auto"/>
+          <w:left w:val="none" w:sz="0" w:space="0" w:color="auto"/>
+          <w:bottom w:val="none" w:sz="0" w:space="0" w:color="auto"/>
+          <w:right w:val="none" w:sz="0" w:space="0" w:color="auto"/>
+          <w:insideH w:val="none" w:sz="0" w:space="0" w:color="auto"/>
+          <w:insideV w:val="none" w:sz="0" w:space="0" w:color="auto"/>
+        </w:tblBorders>
+        <w:tblLayout w:type="fixed"/>
+        <w:tblCellMar>
+          <w:top w:w="0" w:type="dxa"/>
+          <w:left w:w="0" w:type="dxa"/>
+          <w:bottom w:w="0" w:type="dxa"/>
+          <w:right w:w="0" w:type="dxa"/>
+        </w:tblCellMar>
+      </w:tblPr>
+      <w:tblGrid>
+        <w:gridCol w:w="3200"/>
+        <w:gridCol w:w="6666"/>
+      </w:tblGrid>
+      <w:tr>
+        <w:tc>
+          <w:tcPr>
+            <w:tcW w:type="dxa" w:w="3200"/>
+            <w:tcMar>
+              <w:top w:w="200" w:type="dxa"/>
+            </w:tcMar>
+            <w:vAlign w:val="bottom"/>
+          </w:tcPr>
+          <w:p>
+            <w:pPr>
+              <w:spacing w:before="0" w:after="0" w:line="252" w:lineRule="auto"/>
+            </w:pPr>
+            <w:r>
+              <w:rPr>
+                <w:rFonts w:ascii="Helvetica Neue" w:hAnsi="Helvetica Neue" w:cs="Helvetica Neue" w:eastAsia="Helvetica Neue"/>
+                <w:b/>
+                <w:color w:val="212121"/>
+                <w:sz w:val="22"/>
+              </w:rPr>
+              <w:t>Stay.</w:t>
+            </w:r>
+          </w:p>
+          <w:p>
+            <w:pPr>
+              <w:spacing w:before="0" w:after="0" w:line="252" w:lineRule="auto"/>
+            </w:pPr>
+            <w:r>
+              <w:rPr>
+                <w:rFonts w:ascii="Helvetica Neue" w:hAnsi="Helvetica Neue" w:cs="Helvetica Neue" w:eastAsia="Helvetica Neue"/>
+                <w:b/>
+                <w:color w:val="F15822"/>
+                <w:sz w:val="22"/>
+              </w:rPr>
+              <w:t>Experience.</w:t>
+            </w:r>
+          </w:p>
+          <w:p>
+            <w:pPr>
+              <w:spacing w:before="0" w:after="0" w:line="252" w:lineRule="auto"/>
+            </w:pPr>
+            <w:r>
+              <w:rPr>
+                <w:rFonts w:ascii="Helvetica Neue" w:hAnsi="Helvetica Neue" w:cs="Helvetica Neue" w:eastAsia="Helvetica Neue"/>
+                <w:b/>
+                <w:color w:val="212121"/>
+                <w:sz w:val="22"/>
+              </w:rPr>
+              <w:t>Repeat.</w:t>
+            </w:r>
+          </w:p>
+        </w:tc>
+        <w:tc>
+          <w:tcPr>
+            <w:tcW w:type="dxa" w:w="6666"/>
+            <w:tcMar>
+              <w:top w:w="200" w:type="dxa"/>
+            </w:tcMar>
+            <w:vAlign w:val="bottom"/>
+          </w:tcPr>
+          <w:p>
+            <w:pPr>
+              <w:spacing w:before="0" w:after="40"/>
+              <w:jc w:val="right"/>
+            </w:pPr>
+            <w:r>
+              <w:rPr>
+                <w:rFonts w:ascii="Helvetica Neue" w:hAnsi="Helvetica Neue" w:cs="Helvetica Neue" w:eastAsia="Helvetica Neue"/>
+                <w:b w:val="0"/>
+                <w:color w:val="6B655C"/>
+                <w:sz w:val="15"/>
+              </w:rPr>
+              <w:t>Revamp Hospitality LLC · revampvacations.com · hello@revampvacations.com</w:t>
+            </w:r>
+          </w:p>
+          <w:p>
+            <w:pPr>
+              <w:spacing w:before="0" w:after="0"/>
+              <w:jc w:val="right"/>
+            </w:pPr>
+            <w:r>
+              <w:rPr>
+                <w:rFonts w:ascii="Helvetica Neue" w:hAnsi="Helvetica Neue" w:cs="Helvetica Neue" w:eastAsia="Helvetica Neue"/>
+                <w:b w:val="0"/>
+                <w:color w:val="6B655C"/>
+                <w:sz w:val="15"/>
+              </w:rPr>
+              <w:t>Questions about this invoice? Write to hello@revampvacations.com.</w:t>
+            </w:r>
+          </w:p>
+        </w:tc>
+      </w:tr>
+    </w:tbl>
     <w:sectPr>
-      <w:footerReference w:type="default" r:id="rId9"/>
       <w:pgSz w:w="11906" w:h="16838"/>
-      <w:pgMar w:top="794" w:right="1020" w:bottom="1928" w:left="1020" w:header="454" w:footer="680" w:gutter="0"/>
+      <w:pgMar w:top="794" w:right="1020" w:bottom="907" w:left="1020" w:header="454" w:footer="680" w:gutter="0"/>
       <w:cols w:space="720"/>
       <w:docGrid w:linePitch="360"/>
     </w:sectPr>
   </w:body>
 </w:document>
-</file>
-
-<file path=word/footer1.xml><?xml version="1.0" encoding="utf-8"?>
-<w:ftr xmlns:m="http://schemas.openxmlformats.org/officeDocument/2006/math" xmlns:mc="http://schemas.openxmlformats.org/markup-compatibility/2006" xmlns:mo="http://schemas.microsoft.com/office/mac/office/2008/main" xmlns:mv="urn:schemas-microsoft-com:mac:vml" xmlns:o="urn:schemas-microsoft-com:office:office" xmlns:r="http://schemas.openxmlformats.org/officeDocument/2006/relationships" xmlns:v="urn:schemas-microsoft-com:vml" xmlns:w10="urn:schemas-microsoft-com:office:word" xmlns:w14="http://schemas.microsoft.com/office/word/2010/wordml" xmlns:w="http://schemas.openxmlformats.org/wordprocessingml/2006/main" xmlns:wne="http://schemas.microsoft.com/office/word/2006/wordml" xmlns:wp14="http://schemas.microsoft.com/office/word/2010/wordprocessingDrawing" xmlns:wp="http://schemas.openxmlformats.org/drawingml/2006/wordprocessingDrawing" xmlns:wpc="http://schemas.microsoft.com/office/word/2010/wordprocessingCanvas" xmlns:wpg="http://schemas.microsoft.com/office/word/2010/wordprocessingGroup" xmlns:wpi="http://schemas.microsoft.com/office/word/2010/wordprocessingInk" xmlns:wps="http://schemas.microsoft.com/office/word/2010/wordprocessingShape" mc:Ignorable="w14 wp14">
-  <w:p>
-    <w:pPr>
-      <w:pStyle w:val="Footer"/>
-      <w:pBdr>
-        <w:bottom w:val="single" w:sz="4" w:space="0" w:color="E4DED3"/>
-      </w:pBdr>
-      <w:spacing w:before="0" w:after="0" w:lineRule="exact" w:line="40"/>
-    </w:pPr>
-  </w:p>
-  <w:tbl>
-    <w:tblPr>
-      <w:tblW w:w="9866" w:type="dxa"/>
-      <w:tblInd w:w="0" w:type="dxa"/>
-      <w:tblBorders>
-        <w:top w:val="none" w:sz="0" w:space="0" w:color="auto"/>
-        <w:left w:val="none" w:sz="0" w:space="0" w:color="auto"/>
-        <w:bottom w:val="none" w:sz="0" w:space="0" w:color="auto"/>
-        <w:right w:val="none" w:sz="0" w:space="0" w:color="auto"/>
-        <w:insideH w:val="none" w:sz="0" w:space="0" w:color="auto"/>
-        <w:insideV w:val="none" w:sz="0" w:space="0" w:color="auto"/>
-      </w:tblBorders>
-      <w:tblLayout w:type="fixed"/>
-      <w:tblLayout w:type="fixed"/>
-      <w:tblCellMar>
-        <w:top w:w="0" w:type="dxa"/>
-        <w:left w:w="0" w:type="dxa"/>
-        <w:bottom w:w="0" w:type="dxa"/>
-        <w:right w:w="0" w:type="dxa"/>
-      </w:tblCellMar>
-    </w:tblPr>
-    <w:tblGrid>
-      <w:gridCol w:w="3200"/>
-      <w:gridCol w:w="6666"/>
-    </w:tblGrid>
-    <w:tr>
-      <w:tc>
-        <w:tcPr>
-          <w:tcW w:type="dxa" w:w="3200"/>
-          <w:tcMar>
-            <w:top w:w="200" w:type="dxa"/>
-          </w:tcMar>
-          <w:vAlign w:val="bottom"/>
-        </w:tcPr>
-        <w:p>
-          <w:pPr>
-            <w:spacing w:before="0" w:after="0" w:line="252" w:lineRule="auto"/>
-          </w:pPr>
-          <w:r>
-            <w:rPr>
-              <w:rFonts w:ascii="Helvetica Neue" w:hAnsi="Helvetica Neue" w:cs="Helvetica Neue" w:eastAsia="Helvetica Neue"/>
-              <w:b/>
-              <w:color w:val="212121"/>
-              <w:sz w:val="22"/>
-            </w:rPr>
-            <w:t>Stay.</w:t>
-          </w:r>
-        </w:p>
-        <w:p>
-          <w:pPr>
-            <w:spacing w:before="0" w:after="0" w:line="252" w:lineRule="auto"/>
-          </w:pPr>
-          <w:r>
-            <w:rPr>
-              <w:rFonts w:ascii="Helvetica Neue" w:hAnsi="Helvetica Neue" w:cs="Helvetica Neue" w:eastAsia="Helvetica Neue"/>
-              <w:b/>
-              <w:color w:val="F15822"/>
-              <w:sz w:val="22"/>
-            </w:rPr>
-            <w:t>Experience.</w:t>
-          </w:r>
-        </w:p>
-        <w:p>
-          <w:pPr>
-            <w:spacing w:before="0" w:after="0" w:line="252" w:lineRule="auto"/>
-          </w:pPr>
-          <w:r>
-            <w:rPr>
-              <w:rFonts w:ascii="Helvetica Neue" w:hAnsi="Helvetica Neue" w:cs="Helvetica Neue" w:eastAsia="Helvetica Neue"/>
-              <w:b/>
-              <w:color w:val="212121"/>
-              <w:sz w:val="22"/>
-            </w:rPr>
-            <w:t>Repeat.</w:t>
-          </w:r>
-        </w:p>
-      </w:tc>
-      <w:tc>
-        <w:tcPr>
-          <w:tcW w:type="dxa" w:w="6666"/>
-          <w:tcMar>
-            <w:top w:w="200" w:type="dxa"/>
-          </w:tcMar>
-          <w:vAlign w:val="bottom"/>
-        </w:tcPr>
-        <w:p>
-          <w:pPr>
-            <w:spacing w:before="0" w:after="40"/>
-            <w:jc w:val="right"/>
-          </w:pPr>
-          <w:r>
-            <w:rPr>
-              <w:rFonts w:ascii="Helvetica Neue" w:hAnsi="Helvetica Neue" w:cs="Helvetica Neue" w:eastAsia="Helvetica Neue"/>
-              <w:b w:val="0"/>
-              <w:color w:val="6B655C"/>
-              <w:sz w:val="15"/>
-            </w:rPr>
-            <w:t>Revamp Hospitality LLC · revampvacations.com · hello@revampvacations.com</w:t>
-          </w:r>
-        </w:p>
-        <w:p>
-          <w:pPr>
-            <w:spacing w:before="0" w:after="0"/>
-            <w:jc w:val="right"/>
-          </w:pPr>
-          <w:r>
-            <w:rPr>
-              <w:rFonts w:ascii="Helvetica Neue" w:hAnsi="Helvetica Neue" w:cs="Helvetica Neue" w:eastAsia="Helvetica Neue"/>
-              <w:b w:val="0"/>
-              <w:color w:val="6B655C"/>
-              <w:sz w:val="15"/>
-            </w:rPr>
-            <w:t>Questions about this invoice? Reply to this email or write to hello@revampvacations.com.</w:t>
-          </w:r>
-        </w:p>
-      </w:tc>
-    </w:tr>
-  </w:tbl>
-</w:ftr>
 </file>
 
 <file path=word/numbering.xml><?xml version="1.0" encoding="utf-8"?>

</xml_diff>